<commit_message>
Fix cross-region blueprint bug, add a free-tier deployment guide
render.yaml set region: frankfurt on the API but left the database and the key
value store on Render's default, Oregon. The private network is per-region, so
the blueprint would have built cleanly and then failed at boot, unable to reach
either. All three now name the same region explicitly.

docs/DEPLOY.md walks from an empty Render account to a live URL: creating the
blueprint, wiring the two services to each other, claiming the platform admin
account before anyone else can, verifying it, and a troubleshooting table for
the failures that are actually likely. It is honest about what the free tier
is — a demo, not somewhere to keep a shop's real takings, because the free
database is deleted after 30 days and the free instance sleeps.
</commit_message>
<xml_diff>
--- a/docs/word/README.docx
+++ b/docs/word/README.docx
@@ -960,6 +960,60 @@
                 <w:szCs w:val="19"/>
               </w:rPr>
               <w:t xml:space="preserve">What is in it</w:t>
+            </w:r>
+          </w:p>
+        </w:tc>
+      </w:tr>
+      <w:tr>
+        <w:tc>
+          <w:tcPr>
+            <w:tcMar>
+              <w:top w:type="dxa" w:w="80"/>
+              <w:left w:type="dxa" w:w="120"/>
+              <w:bottom w:type="dxa" w:w="80"/>
+              <w:right w:type="dxa" w:w="120"/>
+            </w:tcMar>
+          </w:tcPr>
+          <w:p>
+            <w:pPr>
+              <w:spacing w:after="0" w:line="252"/>
+            </w:pPr>
+            <w:r>
+              <w:rPr>
+                <w:b w:val="false"/>
+                <w:bCs w:val="false"/>
+                <w:i/>
+                <w:iCs/>
+                <w:color w:val="111827"/>
+                <w:sz w:val="20"/>
+                <w:szCs w:val="20"/>
+              </w:rPr>
+              <w:t xml:space="preserve">docs/DEPLOY.md</w:t>
+            </w:r>
+          </w:p>
+        </w:tc>
+        <w:tc>
+          <w:tcPr>
+            <w:tcMar>
+              <w:top w:type="dxa" w:w="80"/>
+              <w:left w:type="dxa" w:w="120"/>
+              <w:bottom w:type="dxa" w:w="80"/>
+              <w:right w:type="dxa" w:w="120"/>
+            </w:tcMar>
+          </w:tcPr>
+          <w:p>
+            <w:pPr>
+              <w:spacing w:after="0" w:line="252"/>
+            </w:pPr>
+            <w:r>
+              <w:rPr>
+                <w:b w:val="false"/>
+                <w:bCs w:val="false"/>
+                <w:color w:val="111827"/>
+                <w:sz w:val="20"/>
+                <w:szCs w:val="20"/>
+              </w:rPr>
+              <w:t xml:space="preserve">Step by step from an empty Render account to a live URL, on the free tier</w:t>
             </w:r>
           </w:p>
         </w:tc>

</xml_diff>